<commit_message>
Restore Eclipse configuration and fix project build path
</commit_message>
<xml_diff>
--- a/DOCUMENTS/3.ER-diagram.docx.docx
+++ b/DOCUMENTS/3.ER-diagram.docx.docx
@@ -36,7 +36,7 @@
     <w:p>
       <w:r>
         <w:pict w14:anchorId="77E52A9B">
-          <v:rect id="_x0000_i1097" style="width:0;height:1.5pt" o:hralign="center" o:hrstd="t" o:hr="t" fillcolor="#a0a0a0" stroked="f"/>
+          <v:rect id="_x0000_i1025" style="width:0;height:1.5pt" o:hralign="center" o:hrstd="t" o:hr="t" fillcolor="#a0a0a0" stroked="f"/>
         </w:pict>
       </w:r>
     </w:p>
@@ -49,10 +49,7 @@
       </w:r>
       <w:proofErr w:type="gramStart"/>
       <w:r>
-        <w:t>By</w:t>
-      </w:r>
-      <w:r>
-        <w:t xml:space="preserve"> :</w:t>
+        <w:t>By :</w:t>
       </w:r>
       <w:proofErr w:type="gramEnd"/>
       <w:r>
@@ -87,10 +84,7 @@
       </w:r>
       <w:proofErr w:type="gramStart"/>
       <w:r>
-        <w:t>Number</w:t>
-      </w:r>
-      <w:r>
-        <w:t xml:space="preserve"> :</w:t>
+        <w:t>Number :</w:t>
       </w:r>
       <w:proofErr w:type="gramEnd"/>
       <w:r>
@@ -104,17 +98,11 @@
       </w:pPr>
       <w:proofErr w:type="gramStart"/>
       <w:r>
-        <w:t>Course</w:t>
-      </w:r>
-      <w:r>
-        <w:t xml:space="preserve"> :</w:t>
+        <w:t>Course :</w:t>
       </w:r>
       <w:proofErr w:type="gramEnd"/>
       <w:r>
-        <w:t xml:space="preserve">- </w:t>
-      </w:r>
-      <w:r>
-        <w:t>Bachelor of Computer Applications (BCA)</w:t>
+        <w:t>- Bachelor of Computer Applications (BCA)</w:t>
       </w:r>
     </w:p>
     <w:p>
@@ -128,17 +116,11 @@
       </w:pPr>
       <w:proofErr w:type="gramStart"/>
       <w:r>
-        <w:t>Semester</w:t>
-      </w:r>
-      <w:r>
-        <w:t xml:space="preserve"> :</w:t>
+        <w:t>Semester :</w:t>
       </w:r>
       <w:proofErr w:type="gramEnd"/>
       <w:r>
-        <w:t xml:space="preserve">- </w:t>
-      </w:r>
-      <w:r>
-        <w:t>Final Year / 6th Semester</w:t>
+        <w:t>- Final Year / 6th Semester</w:t>
       </w:r>
     </w:p>
     <w:p>
@@ -155,10 +137,7 @@
       </w:r>
       <w:proofErr w:type="gramStart"/>
       <w:r>
-        <w:t>To</w:t>
-      </w:r>
-      <w:r>
-        <w:t xml:space="preserve"> :</w:t>
+        <w:t>To :</w:t>
       </w:r>
       <w:proofErr w:type="gramEnd"/>
       <w:r>
@@ -185,10 +164,7 @@
       </w:r>
       <w:proofErr w:type="gramStart"/>
       <w:r>
-        <w:t>Name</w:t>
-      </w:r>
-      <w:r>
-        <w:t xml:space="preserve"> :</w:t>
+        <w:t>Name :</w:t>
       </w:r>
       <w:proofErr w:type="gramEnd"/>
       <w:r>
@@ -241,8 +217,18 @@
           <w:numId w:val="3"/>
         </w:numPr>
       </w:pPr>
-      <w:r>
-        <w:t>Servlet &amp; JSP</w:t>
+      <w:proofErr w:type="gramStart"/>
+      <w:r>
+        <w:t>Html ,</w:t>
+      </w:r>
+      <w:proofErr w:type="spellStart"/>
+      <w:r>
+        <w:t>css</w:t>
+      </w:r>
+      <w:proofErr w:type="spellEnd"/>
+      <w:proofErr w:type="gramEnd"/>
+      <w:r>
+        <w:t xml:space="preserve">, java script </w:t>
       </w:r>
     </w:p>
     <w:p>
@@ -254,7 +240,7 @@
         </w:numPr>
       </w:pPr>
       <w:r>
-        <w:t>MySQL</w:t>
+        <w:t>Servlet &amp; JSP</w:t>
       </w:r>
     </w:p>
     <w:p>
@@ -266,7 +252,7 @@
         </w:numPr>
       </w:pPr>
       <w:r>
-        <w:t>JDBC</w:t>
+        <w:t>MySQL</w:t>
       </w:r>
     </w:p>
     <w:p>
@@ -278,13 +264,25 @@
         </w:numPr>
       </w:pPr>
       <w:r>
+        <w:t>JDBC</w:t>
+      </w:r>
+    </w:p>
+    <w:p>
+      <w:pPr>
+        <w:pStyle w:val="NormalWeb"/>
+        <w:numPr>
+          <w:ilvl w:val="0"/>
+          <w:numId w:val="3"/>
+        </w:numPr>
+      </w:pPr>
+      <w:r>
         <w:t>Apache Tomcat</w:t>
       </w:r>
     </w:p>
     <w:p>
       <w:r>
         <w:pict w14:anchorId="5C471CAD">
-          <v:rect id="_x0000_i1101" style="width:0;height:1.5pt" o:hralign="center" o:hrstd="t" o:hr="t" fillcolor="#a0a0a0" stroked="f"/>
+          <v:rect id="_x0000_i1026" style="width:0;height:1.5pt" o:hralign="center" o:hrstd="t" o:hr="t" fillcolor="#a0a0a0" stroked="f"/>
         </w:pict>
       </w:r>
     </w:p>
@@ -340,7 +338,7 @@
     <w:p>
       <w:r>
         <w:pict w14:anchorId="6F14BAB8">
-          <v:rect id="_x0000_i1159" style="width:0;height:1.5pt" o:hralign="center" o:hrstd="t" o:hr="t" fillcolor="#a0a0a0" stroked="f"/>
+          <v:rect id="_x0000_i1027" style="width:0;height:1.5pt" o:hralign="center" o:hrstd="t" o:hr="t" fillcolor="#a0a0a0" stroked="f"/>
         </w:pict>
       </w:r>
     </w:p>
@@ -367,7 +365,7 @@
     <w:p>
       <w:r>
         <w:pict w14:anchorId="094C1F35">
-          <v:rect id="_x0000_i1160" style="width:0;height:1.5pt" o:hralign="center" o:hrstd="t" o:hr="t" fillcolor="#a0a0a0" stroked="f"/>
+          <v:rect id="_x0000_i1028" style="width:0;height:1.5pt" o:hralign="center" o:hrstd="t" o:hr="t" fillcolor="#a0a0a0" stroked="f"/>
         </w:pict>
       </w:r>
     </w:p>
@@ -676,10 +674,7 @@
             </w:r>
             <w:proofErr w:type="gramEnd"/>
             <w:r>
-              <w:t>10</w:t>
-            </w:r>
-            <w:r>
-              <w:t>)</w:t>
+              <w:t>10)</w:t>
             </w:r>
           </w:p>
         </w:tc>
@@ -746,7 +741,7 @@
     <w:p>
       <w:r>
         <w:pict w14:anchorId="4855D932">
-          <v:rect id="_x0000_i1161" style="width:0;height:1.5pt" o:hralign="center" o:hrstd="t" o:hr="t" fillcolor="#a0a0a0" stroked="f"/>
+          <v:rect id="_x0000_i1029" style="width:0;height:1.5pt" o:hralign="center" o:hrstd="t" o:hr="t" fillcolor="#a0a0a0" stroked="f"/>
         </w:pict>
       </w:r>
     </w:p>
@@ -775,7 +770,7 @@
     <w:p>
       <w:r>
         <w:pict w14:anchorId="207A1BB2">
-          <v:rect id="_x0000_i1162" style="width:0;height:1.5pt" o:hralign="center" o:hrstd="t" o:hr="t" fillcolor="#a0a0a0" stroked="f"/>
+          <v:rect id="_x0000_i1030" style="width:0;height:1.5pt" o:hralign="center" o:hrstd="t" o:hr="t" fillcolor="#a0a0a0" stroked="f"/>
         </w:pict>
       </w:r>
     </w:p>
@@ -820,7 +815,7 @@
     <w:p>
       <w:r>
         <w:pict w14:anchorId="07854EEA">
-          <v:rect id="_x0000_i1163" style="width:0;height:1.5pt" o:hralign="center" o:hrstd="t" o:hr="t" fillcolor="#a0a0a0" stroked="f"/>
+          <v:rect id="_x0000_i1031" style="width:0;height:1.5pt" o:hralign="center" o:hrstd="t" o:hr="t" fillcolor="#a0a0a0" stroked="f"/>
         </w:pict>
       </w:r>
     </w:p>

</xml_diff>